<commit_message>
feat: ajustes pendientes en plantillas, scripts de diagnostico y varios paneles
Incluye trabajo previo acumulado sin commitear: ampliacion de
AnalisisPlantillaDocumentoService (condicionales/bloques de contenido),
ajustes menores en Services de Analisis/Ejecucion/Notificacion/Verificacion,
CatalogoLookupDAO, paneles de Roles/Analisis/Registro/Verificacion, los
scripts SQL de diagnostico/reset de datos de prueba ya documentados en
AGENTS.md, y las plantillas Word bajo docs/plantillas.

No incluye config/sdrerc-app.properties (contiene secretos reales: clave
TOTP y credenciales SMTP en texto plano, no se debe commitear) ni cambios
en docs/arquitectura_app (capturas de pantalla, excluidas a pedido del
usuario).

Co-Authored-By: Claude Sonnet 5 <noreply@anthropic.com>
</commit_message>
<xml_diff>
--- a/docs/plantillas/carta_edicto.docx
+++ b/docs/plantillas/carta_edicto.docx
@@ -205,84 +205,64 @@
           <w:rFonts w:ascii="Arial" w:hAnsi="Arial" w:cs="Arial"/>
           <w:b/>
           <w:bCs/>
+          <w:sz w:val="22"/>
+          <w:szCs w:val="22"/>
+        </w:rPr>
+      </w:pPr>
+      <w:r>
+        <w:rPr>
+          <w:rFonts w:ascii="Arial" w:hAnsi="Arial" w:cs="Arial"/>
+          <w:b/>
+          <w:bCs/>
+          <w:sz w:val="22"/>
+          <w:szCs w:val="22"/>
+        </w:rPr>
+        <w:t>#nomSolicitante#</w:t>
+      </w:r>
+    </w:p>
+    <w:p>
+      <w:pPr>
+        <w:rPr>
+          <w:rFonts w:ascii="Arial" w:hAnsi="Arial" w:cs="Arial"/>
+          <w:sz w:val="22"/>
+          <w:szCs w:val="22"/>
+        </w:rPr>
+      </w:pPr>
+      <w:r>
+        <w:rPr>
+          <w:rFonts w:ascii="Arial" w:hAnsi="Arial" w:cs="Arial"/>
+          <w:sz w:val="22"/>
+          <w:szCs w:val="22"/>
+        </w:rPr>
+        <w:t xml:space="preserve">Dirección Domiciliaria:  </w:t>
+      </w:r>
+      <w:r>
+        <w:rPr>
+          <w:rFonts w:ascii="Arial" w:hAnsi="Arial" w:cs="Arial"/>
+          <w:b/>
+          <w:bCs/>
           <w:iCs/>
           <w:sz w:val="22"/>
           <w:szCs w:val="22"/>
         </w:rPr>
-      </w:pPr>
-      <w:r>
-        <w:rPr>
-          <w:rFonts w:ascii="Arial" w:hAnsi="Arial" w:cs="Arial"/>
-          <w:b/>
-          <w:bCs/>
-          <w:iCs/>
+        <w:t>#direccion#</w:t>
+      </w:r>
+    </w:p>
+    <w:p>
+      <w:pPr>
+        <w:rPr>
+          <w:rFonts w:ascii="Arial" w:hAnsi="Arial" w:cs="Arial"/>
           <w:sz w:val="22"/>
           <w:szCs w:val="22"/>
         </w:rPr>
-        <w:t>#nomTitular#</w:t>
-      </w:r>
-    </w:p>
-    <w:p>
-      <w:pPr>
+      </w:pPr>
+      <w:r>
         <w:rPr>
           <w:rFonts w:ascii="Arial" w:hAnsi="Arial" w:cs="Arial"/>
           <w:sz w:val="22"/>
           <w:szCs w:val="22"/>
         </w:rPr>
-      </w:pPr>
-      <w:r>
-        <w:rPr>
-          <w:rFonts w:ascii="Arial" w:hAnsi="Arial" w:cs="Arial"/>
-          <w:sz w:val="22"/>
-          <w:szCs w:val="22"/>
-        </w:rPr>
-        <w:t xml:space="preserve">Dirección Domiciliaria:  </w:t>
-      </w:r>
-      <w:r>
-        <w:rPr>
-          <w:rFonts w:ascii="Arial" w:hAnsi="Arial" w:cs="Arial"/>
-          <w:b/>
-          <w:bCs/>
-          <w:iCs/>
-          <w:sz w:val="22"/>
-          <w:szCs w:val="22"/>
-        </w:rPr>
-        <w:t>#direccion#</w:t>
-      </w:r>
-    </w:p>
-    <w:p>
-      <w:pPr>
-        <w:rPr>
-          <w:rFonts w:ascii="Arial" w:hAnsi="Arial" w:cs="Arial"/>
-          <w:sz w:val="22"/>
-          <w:szCs w:val="22"/>
-        </w:rPr>
-      </w:pPr>
-      <w:r>
-        <w:rPr>
-          <w:rFonts w:ascii="Arial" w:hAnsi="Arial" w:cs="Arial"/>
-          <w:sz w:val="22"/>
-          <w:szCs w:val="22"/>
-        </w:rPr>
-        <w:t xml:space="preserve">Correo electrónico   </w:t>
-      </w:r>
-      <w:proofErr w:type="gramStart"/>
-      <w:r>
-        <w:rPr>
-          <w:rFonts w:ascii="Arial" w:hAnsi="Arial" w:cs="Arial"/>
-          <w:sz w:val="22"/>
-          <w:szCs w:val="22"/>
-        </w:rPr>
-        <w:t xml:space="preserve">  :</w:t>
-      </w:r>
-      <w:proofErr w:type="gramEnd"/>
-      <w:r>
-        <w:rPr>
-          <w:rFonts w:ascii="Arial" w:hAnsi="Arial" w:cs="Arial"/>
-          <w:sz w:val="22"/>
-          <w:szCs w:val="22"/>
-        </w:rPr>
-        <w:t xml:space="preserve">  </w:t>
+        <w:t xml:space="preserve">Correo electrónico     :  </w:t>
       </w:r>
       <w:r>
         <w:rPr>
@@ -716,7 +696,38 @@
           <w:szCs w:val="20"/>
           <w:lang w:val="es-PE" w:eastAsia="en-US"/>
         </w:rPr>
-        <w:t xml:space="preserve">que, la solicitud de Rectificación Administrativa del Acta de </w:t>
+        <w:t xml:space="preserve">que, la solicitud de </w:t>
+      </w:r>
+      <w:r>
+        <w:rPr>
+          <w:rFonts w:ascii="Arial" w:hAnsi="Arial" w:cs="Arial"/>
+          <w:b/>
+          <w:bCs/>
+          <w:sz w:val="20"/>
+          <w:szCs w:val="20"/>
+          <w:lang w:eastAsia="es-PE"/>
+        </w:rPr>
+        <w:t>#tipoProcedimiento#</w:t>
+      </w:r>
+      <w:r>
+        <w:rPr>
+          <w:rFonts w:ascii="Arial" w:hAnsi="Arial" w:cs="Arial"/>
+          <w:b/>
+          <w:sz w:val="20"/>
+          <w:szCs w:val="20"/>
+          <w:lang w:eastAsia="es-PE"/>
+        </w:rPr>
+        <w:t xml:space="preserve"> </w:t>
+      </w:r>
+      <w:r>
+        <w:rPr>
+          <w:rFonts w:ascii="Arial" w:eastAsia="Calibri" w:hAnsi="Arial" w:cs="Arial"/>
+          <w:color w:val="000000"/>
+          <w:sz w:val="20"/>
+          <w:szCs w:val="20"/>
+          <w:lang w:val="es-PE" w:eastAsia="en-US"/>
+        </w:rPr>
+        <w:t xml:space="preserve">del Acta de </w:t>
       </w:r>
       <w:r>
         <w:rPr>
@@ -1010,29 +1021,7 @@
           <w:szCs w:val="20"/>
           <w:lang w:val="es-PE" w:eastAsia="en-US"/>
         </w:rPr>
-        <w:t xml:space="preserve">(https://apps.reniec.gob.pe/MesaPartesVirtual/). Así mismo indicar que, para cualquier consulta adicional sobre el trámite iniciado ante esta </w:t>
-      </w:r>
-      <w:proofErr w:type="gramStart"/>
-      <w:r>
-        <w:rPr>
-          <w:rFonts w:ascii="Arial" w:eastAsia="Calibri" w:hAnsi="Arial" w:cs="Arial"/>
-          <w:color w:val="000000"/>
-          <w:sz w:val="20"/>
-          <w:szCs w:val="20"/>
-          <w:lang w:val="es-PE" w:eastAsia="en-US"/>
-        </w:rPr>
-        <w:t>Sub Dirección</w:t>
-      </w:r>
-      <w:proofErr w:type="gramEnd"/>
-      <w:r>
-        <w:rPr>
-          <w:rFonts w:ascii="Arial" w:eastAsia="Calibri" w:hAnsi="Arial" w:cs="Arial"/>
-          <w:color w:val="000000"/>
-          <w:sz w:val="20"/>
-          <w:szCs w:val="20"/>
-          <w:lang w:val="es-PE" w:eastAsia="en-US"/>
-        </w:rPr>
-        <w:t xml:space="preserve">, puede realizarlo a través al correo institucional: </w:t>
+        <w:t xml:space="preserve">(https://apps.reniec.gob.pe/MesaPartesVirtual/). Así mismo indicar que, para cualquier consulta adicional sobre el trámite iniciado ante esta Sub Dirección, puede realizarlo a través al correo institucional: </w:t>
       </w:r>
       <w:r>
         <w:rPr>
@@ -1138,20 +1127,8 @@
           <w:szCs w:val="20"/>
           <w:lang w:val="es-PE" w:eastAsia="en-US"/>
         </w:rPr>
-        <w:t>/</w:t>
-      </w:r>
-      <w:proofErr w:type="spellStart"/>
-      <w:r>
-        <w:rPr>
-          <w:rFonts w:ascii="Arial" w:eastAsia="Calibri" w:hAnsi="Arial" w:cs="Arial"/>
-          <w:color w:val="000000"/>
-          <w:sz w:val="20"/>
-          <w:szCs w:val="20"/>
-          <w:lang w:val="es-PE" w:eastAsia="en-US"/>
-        </w:rPr>
-        <w:t>phc</w:t>
-      </w:r>
-      <w:proofErr w:type="spellEnd"/>
+        <w:t>/phc</w:t>
+      </w:r>
     </w:p>
     <w:p>
       <w:pPr>
@@ -1240,7 +1217,7 @@
           </mc:Choice>
           <mc:Fallback>
             <w:pict>
-              <v:line w14:anchorId="6DBDDECC" id="Conector recto 1" o:spid="_x0000_s1026" style="position:absolute;flip:y;z-index:251659264;visibility:visible;mso-wrap-style:square;mso-width-percent:0;mso-height-percent:0;mso-wrap-distance-left:9pt;mso-wrap-distance-top:0;mso-wrap-distance-right:9pt;mso-wrap-distance-bottom:0;mso-position-horizontal:absolute;mso-position-horizontal-relative:text;mso-position-vertical:absolute;mso-position-vertical-relative:text;mso-width-percent:0;mso-height-percent:0;mso-width-relative:margin;mso-height-relative:margin" from="-1.55pt,13.2pt" to="423.45pt,15.7pt" o:gfxdata="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" strokecolor="black [3213]" strokeweight="1pt">
+              <v:line w14:anchorId="03224DF8" id="Conector recto 1" o:spid="_x0000_s1026" style="position:absolute;flip:y;z-index:251659264;visibility:visible;mso-wrap-style:square;mso-width-percent:0;mso-height-percent:0;mso-wrap-distance-left:9pt;mso-wrap-distance-top:0;mso-wrap-distance-right:9pt;mso-wrap-distance-bottom:0;mso-position-horizontal:absolute;mso-position-horizontal-relative:text;mso-position-vertical:absolute;mso-position-vertical-relative:text;mso-width-percent:0;mso-height-percent:0;mso-width-relative:margin;mso-height-relative:margin" from="-1.55pt,13.2pt" to="423.45pt,15.7pt" o:gfxdata="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" strokecolor="black [3213]" strokeweight="1pt">
                 <v:stroke dashstyle="1 1" joinstyle="miter"/>
                 <w10:wrap type="square"/>
               </v:line>
@@ -1344,54 +1321,153 @@
           <w:color w:val="000000"/>
           <w:sz w:val="16"/>
           <w:szCs w:val="16"/>
-          <w:highlight w:val="yellow"/>
-          <w:lang w:val="es-PE" w:eastAsia="en-US"/>
-        </w:rPr>
-        <w:t>AUGUSTA NOEMI CHACON RODRIGUEZ</w:t>
-      </w:r>
-      <w:r>
-        <w:rPr>
-          <w:rFonts w:ascii="Arial" w:eastAsia="Calibri" w:hAnsi="Arial" w:cs="Arial"/>
-          <w:color w:val="000000"/>
-          <w:sz w:val="16"/>
-          <w:szCs w:val="16"/>
-          <w:lang w:val="es-PE" w:eastAsia="en-US"/>
-        </w:rPr>
-        <w:t xml:space="preserve">, identificado con DNI N° </w:t>
-      </w:r>
-      <w:r>
-        <w:rPr>
-          <w:rFonts w:ascii="Arial" w:eastAsia="Calibri" w:hAnsi="Arial" w:cs="Arial"/>
-          <w:color w:val="000000"/>
-          <w:sz w:val="16"/>
-          <w:szCs w:val="16"/>
-          <w:highlight w:val="yellow"/>
-          <w:lang w:val="es-PE" w:eastAsia="en-US"/>
-        </w:rPr>
-        <w:t>23882034</w:t>
-      </w:r>
-      <w:r>
-        <w:rPr>
-          <w:rFonts w:ascii="Arial" w:eastAsia="Calibri" w:hAnsi="Arial" w:cs="Arial"/>
-          <w:color w:val="000000"/>
-          <w:sz w:val="16"/>
-          <w:szCs w:val="16"/>
-          <w:lang w:val="es-PE" w:eastAsia="en-US"/>
-        </w:rPr>
-        <w:t xml:space="preserve">, solicita la Rectificación Administrativa del Acta de Nacimiento N° 1009396028 correspondiente a </w:t>
-      </w:r>
-      <w:r>
-        <w:rPr>
-          <w:rFonts w:ascii="Arial" w:eastAsia="Calibri" w:hAnsi="Arial" w:cs="Arial"/>
-          <w:b/>
-          <w:bCs/>
-          <w:color w:val="000000"/>
-          <w:sz w:val="16"/>
-          <w:szCs w:val="16"/>
-          <w:highlight w:val="yellow"/>
-          <w:lang w:val="es-PE" w:eastAsia="en-US"/>
-        </w:rPr>
-        <w:t>AUGUSTA NOEMÍ CHACÓN RODRÍGUEZ</w:t>
+          <w:lang w:val="es-PE" w:eastAsia="en-US"/>
+        </w:rPr>
+        <w:t>#nomSolicitante#</w:t>
+      </w:r>
+      <w:r>
+        <w:rPr>
+          <w:rFonts w:ascii="Arial" w:eastAsia="Calibri" w:hAnsi="Arial" w:cs="Arial"/>
+          <w:b/>
+          <w:bCs/>
+          <w:color w:val="000000"/>
+          <w:sz w:val="16"/>
+          <w:szCs w:val="16"/>
+          <w:lang w:val="es-PE" w:eastAsia="en-US"/>
+        </w:rPr>
+        <w:t>,</w:t>
+      </w:r>
+      <w:r>
+        <w:rPr>
+          <w:rFonts w:ascii="Arial" w:eastAsia="Calibri" w:hAnsi="Arial" w:cs="Arial"/>
+          <w:color w:val="000000"/>
+          <w:sz w:val="16"/>
+          <w:szCs w:val="16"/>
+          <w:lang w:val="es-PE" w:eastAsia="en-US"/>
+        </w:rPr>
+        <w:t xml:space="preserve"> identificado con DNI N° </w:t>
+      </w:r>
+      <w:r>
+        <w:rPr>
+          <w:rFonts w:ascii="Arial" w:eastAsia="Calibri" w:hAnsi="Arial" w:cs="Arial"/>
+          <w:b/>
+          <w:bCs/>
+          <w:color w:val="000000"/>
+          <w:sz w:val="16"/>
+          <w:szCs w:val="16"/>
+          <w:lang w:val="es-PE" w:eastAsia="en-US"/>
+        </w:rPr>
+        <w:t>#dniSolicitante#</w:t>
+      </w:r>
+      <w:r>
+        <w:rPr>
+          <w:rFonts w:ascii="Arial" w:eastAsia="Calibri" w:hAnsi="Arial" w:cs="Arial"/>
+          <w:b/>
+          <w:bCs/>
+          <w:color w:val="000000"/>
+          <w:sz w:val="16"/>
+          <w:szCs w:val="16"/>
+          <w:lang w:val="es-PE" w:eastAsia="en-US"/>
+        </w:rPr>
+        <w:t>,</w:t>
+      </w:r>
+      <w:r>
+        <w:rPr>
+          <w:rFonts w:ascii="Arial" w:eastAsia="Calibri" w:hAnsi="Arial" w:cs="Arial"/>
+          <w:color w:val="000000"/>
+          <w:sz w:val="16"/>
+          <w:szCs w:val="16"/>
+          <w:lang w:val="es-PE" w:eastAsia="en-US"/>
+        </w:rPr>
+        <w:t xml:space="preserve"> solicita la Rectificación Administrativa del Acta de </w:t>
+      </w:r>
+      <w:r>
+        <w:rPr>
+          <w:rFonts w:ascii="Arial" w:eastAsia="Calibri" w:hAnsi="Arial" w:cs="Arial"/>
+          <w:b/>
+          <w:bCs/>
+          <w:color w:val="000000"/>
+          <w:sz w:val="16"/>
+          <w:szCs w:val="16"/>
+          <w:lang w:val="es-PE" w:eastAsia="en-US"/>
+        </w:rPr>
+        <w:t>#tipoActa#</w:t>
+      </w:r>
+      <w:r>
+        <w:rPr>
+          <w:rFonts w:ascii="Arial" w:eastAsia="Calibri" w:hAnsi="Arial" w:cs="Arial"/>
+          <w:color w:val="000000"/>
+          <w:sz w:val="16"/>
+          <w:szCs w:val="16"/>
+          <w:lang w:val="es-PE" w:eastAsia="en-US"/>
+        </w:rPr>
+        <w:t xml:space="preserve"> </w:t>
+      </w:r>
+      <w:r>
+        <w:rPr>
+          <w:rFonts w:ascii="Arial" w:eastAsia="Calibri" w:hAnsi="Arial" w:cs="Arial"/>
+          <w:color w:val="000000"/>
+          <w:sz w:val="16"/>
+          <w:szCs w:val="16"/>
+          <w:lang w:val="es-PE" w:eastAsia="en-US"/>
+        </w:rPr>
+        <w:t>N</w:t>
+      </w:r>
+      <w:r>
+        <w:rPr>
+          <w:rFonts w:ascii="Arial" w:eastAsia="Calibri" w:hAnsi="Arial" w:cs="Arial"/>
+          <w:b/>
+          <w:bCs/>
+          <w:color w:val="000000"/>
+          <w:sz w:val="16"/>
+          <w:szCs w:val="16"/>
+          <w:lang w:val="es-PE" w:eastAsia="en-US"/>
+        </w:rPr>
+        <w:t xml:space="preserve">° </w:t>
+      </w:r>
+      <w:r>
+        <w:rPr>
+          <w:rFonts w:ascii="Arial" w:eastAsia="Calibri" w:hAnsi="Arial" w:cs="Arial"/>
+          <w:b/>
+          <w:bCs/>
+          <w:color w:val="000000"/>
+          <w:sz w:val="16"/>
+          <w:szCs w:val="16"/>
+          <w:lang w:val="es-PE" w:eastAsia="en-US"/>
+        </w:rPr>
+        <w:t>#nroActa#</w:t>
+      </w:r>
+      <w:r>
+        <w:rPr>
+          <w:rFonts w:ascii="Arial" w:eastAsia="Calibri" w:hAnsi="Arial" w:cs="Arial"/>
+          <w:color w:val="000000"/>
+          <w:sz w:val="16"/>
+          <w:szCs w:val="16"/>
+          <w:lang w:val="es-PE" w:eastAsia="en-US"/>
+        </w:rPr>
+        <w:t xml:space="preserve"> </w:t>
+      </w:r>
+      <w:r>
+        <w:rPr>
+          <w:rFonts w:ascii="Arial" w:eastAsia="Calibri" w:hAnsi="Arial" w:cs="Arial"/>
+          <w:color w:val="000000"/>
+          <w:sz w:val="16"/>
+          <w:szCs w:val="16"/>
+          <w:lang w:val="es-PE" w:eastAsia="en-US"/>
+        </w:rPr>
+        <w:t xml:space="preserve">correspondiente a </w:t>
+      </w:r>
+      <w:r>
+        <w:rPr>
+          <w:rFonts w:ascii="Arial" w:eastAsia="Calibri" w:hAnsi="Arial" w:cs="Arial"/>
+          <w:b/>
+          <w:bCs/>
+          <w:color w:val="000000"/>
+          <w:sz w:val="16"/>
+          <w:szCs w:val="16"/>
+          <w:lang w:val="es-PE" w:eastAsia="en-US"/>
+        </w:rPr>
+        <w:t>#nomTitular#</w:t>
       </w:r>
       <w:r>
         <w:rPr>

</xml_diff>